<commit_message>
Draft_079: add Hu & Cao abstract hedge-rate comparison (1.08 vs 2.04)
</commit_message>
<xml_diff>
--- a/thesis/003_ThesisProposal_Draft_079.docx
+++ b/thesis/003_ThesisProposal_Draft_079.docx
@@ -4379,21 +4379,11 @@
       </w:pPr>
       <w:r>
         <w:rPr>
-          <w:rFonts w:ascii="Georgia" w:cs="Georgia" w:eastAsia="Georgia" w:hAnsi="Georgia"/>
-          <w:b w:val="0"/>
-          <w:bCs w:val="0"/>
-          <w:i w:val="0"/>
-          <w:iCs w:val="0"/>
-          <w:sz w:val="22"/>
-          <w:szCs w:val="22"/>
-          <w:rtl w:val="0"/>
-        </w:rPr>
-        <w:t xml:space="preserve">The coding identified 65 hedge tokens across the 60-abstract corpus. These tokens were classified into four types following Hyland’s (1998) taxonomy: modal verbs, lexical hedges, adverbial hedges, and clause-level hedges. Table 2 presents the distribution of hedge types across the full corpus.</w:t>
-      </w:r>
-      <w:r>
-        <w:rPr>
-          <w:rtl w:val="0"/>
-        </w:rPr>
+          <w:rFonts w:ascii="Georgia" w:hAnsi="Georgia" w:cs="Georgia" w:eastAsia="Georgia"/>
+          <w:sz w:val="24"/>
+          <w:szCs w:val="24"/>
+        </w:rPr>
+        <w:t xml:space="preserve">The coding identified 65 hedge tokens across the 60-abstract corpus, or about 1.08 hedges per abstract. That rate sits near the lower end of published abstract figures. Hu and Cao (2011) reported about 2.04 hedges per abstract in English-medium applied linguistics journals and lower rates in Chinese-medium journals. These tokens were classified into four types following Hyland’s (1998) taxonomy: modal verbs, lexical hedges, adverbial hedges, and clause-level hedges. Table 2 presents the distribution of hedge types across the full corpus.</w:t>
       </w:r>
     </w:p>
     <w:p>

</xml_diff>

<commit_message>
Draft_079: 1 inch margins all sides (top bottom left right) on every section
</commit_message>
<xml_diff>
--- a/thesis/003_ThesisProposal_Draft_079.docx
+++ b/thesis/003_ThesisProposal_Draft_079.docx
@@ -288,7 +288,7 @@
           <w:headerReference r:id="rId6" w:type="default"/>
           <w:footerReference r:id="rId7" w:type="default"/>
           <w:pgSz w:h="16838" w:w="11906" w:orient="portrait"/>
-          <w:pgMar w:bottom="1440" w:top="1440" w:left="2160" w:right="1440" w:header="720" w:footer="720"/>
+          <w:pgMar w:bottom="1440" w:top="1440" w:left="1440" w:right="1440" w:header="720" w:footer="720"/>
           <w:pgNumType w:start="1"/>
         </w:sectPr>
       </w:pPr>
@@ -2361,7 +2361,7 @@
           <w:headerReference r:id="rId10" w:type="first"/>
           <w:type w:val="nextPage"/>
           <w:pgSz w:h="16838" w:w="11906" w:orient="portrait"/>
-          <w:pgMar w:bottom="1440" w:top="1440" w:left="2160" w:right="1440" w:header="720" w:footer="720"/>
+          <w:pgMar w:bottom="1440" w:top="1440" w:left="1440" w:right="1440" w:header="720" w:footer="720"/>
           <w:titlePg w:val="1"/>
         </w:sectPr>
       </w:pPr>
@@ -4270,7 +4270,7 @@
           <w:headerReference r:id="rId12" w:type="first"/>
           <w:type w:val="nextPage"/>
           <w:pgSz w:h="16838" w:w="11906" w:orient="portrait"/>
-          <w:pgMar w:bottom="1440" w:top="1440" w:left="2160" w:right="1440" w:header="720" w:footer="720"/>
+          <w:pgMar w:bottom="1440" w:top="1440" w:left="1440" w:right="1440" w:header="720" w:footer="720"/>
           <w:titlePg w:val="1"/>
         </w:sectPr>
       </w:pPr>
@@ -11736,7 +11736,7 @@
           <w:headerReference r:id="rId14" w:type="first"/>
           <w:type w:val="nextPage"/>
           <w:pgSz w:h="16838" w:w="11906" w:orient="portrait"/>
-          <w:pgMar w:bottom="1440" w:top="1440" w:left="2160" w:right="1440" w:header="720" w:footer="720"/>
+          <w:pgMar w:bottom="1440" w:top="1440" w:left="1440" w:right="1440" w:header="720" w:footer="720"/>
           <w:titlePg w:val="1"/>
         </w:sectPr>
       </w:pPr>
@@ -12557,7 +12557,7 @@
           <w:headerReference r:id="rId16" w:type="first"/>
           <w:type w:val="nextPage"/>
           <w:pgSz w:h="16838" w:w="11906" w:orient="portrait"/>
-          <w:pgMar w:bottom="1440" w:top="1440" w:left="2160" w:right="1440" w:header="720" w:footer="720"/>
+          <w:pgMar w:bottom="1440" w:top="1440" w:left="1440" w:right="1440" w:header="720" w:footer="720"/>
           <w:titlePg w:val="1"/>
         </w:sectPr>
       </w:pPr>
@@ -21343,7 +21343,7 @@
           <w:headerReference r:id="rId18" w:type="first"/>
           <w:type w:val="nextPage"/>
           <w:pgSz w:h="16838" w:w="11906" w:orient="portrait"/>
-          <w:pgMar w:bottom="1440" w:top="1440" w:left="2160" w:right="1440" w:header="720" w:footer="720"/>
+          <w:pgMar w:bottom="1440" w:top="1440" w:left="1440" w:right="1440" w:header="720" w:footer="720"/>
           <w:titlePg w:val="1"/>
         </w:sectPr>
       </w:pPr>
@@ -30061,7 +30061,7 @@
     <w:sectPr>
       <w:type w:val="nextPage"/>
       <w:pgSz w:h="16838" w:w="11906" w:orient="portrait"/>
-      <w:pgMar w:bottom="1440" w:top="1440" w:left="2160" w:right="1440" w:header="720" w:footer="720"/>
+      <w:pgMar w:bottom="1440" w:top="1440" w:left="1440" w:right="1440" w:header="720" w:footer="720"/>
     </w:sectPr>
   </w:body>
 </w:document>

</xml_diff>

<commit_message>
Draft_079: margins all pages — left 1.5in binding, top/right/bottom 1in
</commit_message>
<xml_diff>
--- a/thesis/003_ThesisProposal_Draft_079.docx
+++ b/thesis/003_ThesisProposal_Draft_079.docx
@@ -288,7 +288,7 @@
           <w:headerReference r:id="rId6" w:type="default"/>
           <w:footerReference r:id="rId7" w:type="default"/>
           <w:pgSz w:h="16838" w:w="11906" w:orient="portrait"/>
-          <w:pgMar w:bottom="1440" w:top="1440" w:left="1440" w:right="1440" w:header="720" w:footer="720"/>
+          <w:pgMar w:bottom="1440" w:top="1440" w:left="2160" w:right="1440" w:header="720" w:footer="720"/>
           <w:pgNumType w:start="1"/>
         </w:sectPr>
       </w:pPr>
@@ -2361,7 +2361,7 @@
           <w:headerReference r:id="rId10" w:type="first"/>
           <w:type w:val="nextPage"/>
           <w:pgSz w:h="16838" w:w="11906" w:orient="portrait"/>
-          <w:pgMar w:bottom="1440" w:top="1440" w:left="1440" w:right="1440" w:header="720" w:footer="720"/>
+          <w:pgMar w:bottom="1440" w:top="1440" w:left="2160" w:right="1440" w:header="720" w:footer="720"/>
           <w:titlePg w:val="1"/>
         </w:sectPr>
       </w:pPr>
@@ -4270,7 +4270,7 @@
           <w:headerReference r:id="rId12" w:type="first"/>
           <w:type w:val="nextPage"/>
           <w:pgSz w:h="16838" w:w="11906" w:orient="portrait"/>
-          <w:pgMar w:bottom="1440" w:top="1440" w:left="1440" w:right="1440" w:header="720" w:footer="720"/>
+          <w:pgMar w:bottom="1440" w:top="1440" w:left="2160" w:right="1440" w:header="720" w:footer="720"/>
           <w:titlePg w:val="1"/>
         </w:sectPr>
       </w:pPr>
@@ -11736,7 +11736,7 @@
           <w:headerReference r:id="rId14" w:type="first"/>
           <w:type w:val="nextPage"/>
           <w:pgSz w:h="16838" w:w="11906" w:orient="portrait"/>
-          <w:pgMar w:bottom="1440" w:top="1440" w:left="1440" w:right="1440" w:header="720" w:footer="720"/>
+          <w:pgMar w:bottom="1440" w:top="1440" w:left="2160" w:right="1440" w:header="720" w:footer="720"/>
           <w:titlePg w:val="1"/>
         </w:sectPr>
       </w:pPr>
@@ -12557,7 +12557,7 @@
           <w:headerReference r:id="rId16" w:type="first"/>
           <w:type w:val="nextPage"/>
           <w:pgSz w:h="16838" w:w="11906" w:orient="portrait"/>
-          <w:pgMar w:bottom="1440" w:top="1440" w:left="1440" w:right="1440" w:header="720" w:footer="720"/>
+          <w:pgMar w:bottom="1440" w:top="1440" w:left="2160" w:right="1440" w:header="720" w:footer="720"/>
           <w:titlePg w:val="1"/>
         </w:sectPr>
       </w:pPr>
@@ -21343,7 +21343,7 @@
           <w:headerReference r:id="rId18" w:type="first"/>
           <w:type w:val="nextPage"/>
           <w:pgSz w:h="16838" w:w="11906" w:orient="portrait"/>
-          <w:pgMar w:bottom="1440" w:top="1440" w:left="1440" w:right="1440" w:header="720" w:footer="720"/>
+          <w:pgMar w:bottom="1440" w:top="1440" w:left="2160" w:right="1440" w:header="720" w:footer="720"/>
           <w:titlePg w:val="1"/>
         </w:sectPr>
       </w:pPr>
@@ -30061,7 +30061,7 @@
     <w:sectPr>
       <w:type w:val="nextPage"/>
       <w:pgSz w:h="16838" w:w="11906" w:orient="portrait"/>
-      <w:pgMar w:bottom="1440" w:top="1440" w:left="1440" w:right="1440" w:header="720" w:footer="720"/>
+      <w:pgMar w:bottom="1440" w:top="1440" w:left="2160" w:right="1440" w:header="720" w:footer="720"/>
     </w:sectPr>
   </w:body>
 </w:document>

</xml_diff>